<commit_message>
Renamed welcome screen to success screen. Created new welcome screen that leads into signup screen.
</commit_message>
<xml_diff>
--- a/JacobThomas_Signup_App_Questions.docx
+++ b/JacobThomas_Signup_App_Questions.docx
@@ -4,14 +4,51 @@
   <w:body>
     <w:p>
       <w:pPr>
+        <w:ind w:left="720" w:hanging="360"/>
+      </w:pPr>
+      <w:r>
+        <w:t>Jacob Thomas</w:t>
+      </w:r>
+    </w:p>
+    <w:p>
+      <w:pPr>
+        <w:ind w:left="720" w:hanging="360"/>
+      </w:pPr>
+      <w:r>
+        <w:t>https://github.com/jjacob-t/MAD_In_Class09</w:t>
+      </w:r>
+    </w:p>
+    <w:p>
+      <w:pPr>
         <w:pStyle w:val="ListParagraph"/>
         <w:numPr>
           <w:ilvl w:val="0"/>
           <w:numId w:val="1"/>
         </w:numPr>
       </w:pPr>
-      <w:r>
-        <w:t xml:space="preserve">SignupPage uses a StatefulWidget because it contains entry forms and reactive messages, which means the state of the page will change. If StatelessWidget was used instead, messages such as “Please enter your name” would not be displayed after the user attempts to make an account with the name field empty. </w:t>
+      <w:proofErr w:type="spellStart"/>
+      <w:r>
+        <w:t>SignupPage</w:t>
+      </w:r>
+      <w:proofErr w:type="spellEnd"/>
+      <w:r>
+        <w:t xml:space="preserve"> uses a </w:t>
+      </w:r>
+      <w:proofErr w:type="spellStart"/>
+      <w:r>
+        <w:t>StatefulWidget</w:t>
+      </w:r>
+      <w:proofErr w:type="spellEnd"/>
+      <w:r>
+        <w:t xml:space="preserve"> because it contains entry forms and reactive messages, which means the state of the page will change. If </w:t>
+      </w:r>
+      <w:proofErr w:type="spellStart"/>
+      <w:r>
+        <w:t>StatelessWidget</w:t>
+      </w:r>
+      <w:proofErr w:type="spellEnd"/>
+      <w:r>
+        <w:t xml:space="preserve"> was used instead, messages such as “Please enter your name” would not be displayed after the user attempts to make an account with the name field empty. </w:t>
       </w:r>
     </w:p>
     <w:p>
@@ -43,8 +80,13 @@
       <w:r>
         <w:t xml:space="preserve">Widgets can have a child or multiple children that will inherit properties from them the same way a child inherits traits from their parents. </w:t>
       </w:r>
-      <w:r>
-        <w:t>TextFormField is a good example of encapsulation because it hides the complexity of taking user input, displaying it live</w:t>
+      <w:proofErr w:type="spellStart"/>
+      <w:r>
+        <w:t>TextFormField</w:t>
+      </w:r>
+      <w:proofErr w:type="spellEnd"/>
+      <w:r>
+        <w:t xml:space="preserve"> is a good example of encapsulation because it hides the complexity of taking user input, displaying it live</w:t>
       </w:r>
       <w:r>
         <w:t xml:space="preserve"> as the user types, displaying the cursor blinking, etc. It does all of this automatically.</w:t>
@@ -53,7 +95,15 @@
         <w:t xml:space="preserve"> The tree structure shows separation of concerns because </w:t>
       </w:r>
       <w:r>
-        <w:t>each level can handle one main thing and pass it down to its children. MaterialApp can handle theme data, Scaffold handles</w:t>
+        <w:t xml:space="preserve">each level can handle one main thing and pass it down to its children. </w:t>
+      </w:r>
+      <w:proofErr w:type="spellStart"/>
+      <w:r>
+        <w:t>MaterialApp</w:t>
+      </w:r>
+      <w:proofErr w:type="spellEnd"/>
+      <w:r>
+        <w:t xml:space="preserve"> can handle theme data, Scaffold handles</w:t>
       </w:r>
       <w:r>
         <w:t xml:space="preserve"> page layout, and so on.</w:t>
@@ -89,7 +139,15 @@
         </w:numPr>
       </w:pPr>
       <w:r>
-        <w:t xml:space="preserve">The SnackBar’s message is small and temporary, so it is possible the user can miss the feedback. </w:t>
+        <w:t xml:space="preserve">The </w:t>
+      </w:r>
+      <w:proofErr w:type="spellStart"/>
+      <w:r>
+        <w:t>SnackBar’s</w:t>
+      </w:r>
+      <w:proofErr w:type="spellEnd"/>
+      <w:r>
+        <w:t xml:space="preserve"> message is small and temporary, so it is possible the user can miss the feedback. </w:t>
       </w:r>
       <w:r>
         <w:t xml:space="preserve">It also doesn’t stop the user from interacting with the form. </w:t>
@@ -230,7 +288,16 @@
         <w:t xml:space="preserve"> conditionals for error display. </w:t>
       </w:r>
       <w:r>
-        <w:t>A disadvantage is having to use the GlobalKey approach</w:t>
+        <w:t xml:space="preserve">A disadvantage is having to use the </w:t>
+      </w:r>
+      <w:proofErr w:type="spellStart"/>
+      <w:r>
+        <w:lastRenderedPageBreak/>
+        <w:t>GlobalKey</w:t>
+      </w:r>
+      <w:proofErr w:type="spellEnd"/>
+      <w:r>
+        <w:t xml:space="preserve"> approach</w:t>
       </w:r>
       <w:r>
         <w:t xml:space="preserve">, which feels like a workaround. </w:t>
@@ -263,11 +330,7 @@
         <w:t xml:space="preserve">. As mentioned before, not doing this </w:t>
       </w:r>
       <w:r>
-        <w:t xml:space="preserve">can result in slowdowns and </w:t>
-      </w:r>
-      <w:r>
-        <w:lastRenderedPageBreak/>
-        <w:t xml:space="preserve">memory leaks for larger and longer running apps. Another </w:t>
+        <w:t xml:space="preserve">can result in slowdowns and memory leaks for larger and longer running apps. Another </w:t>
       </w:r>
       <w:r>
         <w:t>improvement</w:t>
@@ -276,7 +339,15 @@
         <w:t xml:space="preserve"> </w:t>
       </w:r>
       <w:r>
-        <w:t xml:space="preserve">I would make is to move the validation logic out of the UI. Right now, it is mixed inline with widget code, but in a </w:t>
+        <w:t xml:space="preserve">I would make is to move the validation logic out of the UI. Right now, it is mixed </w:t>
+      </w:r>
+      <w:proofErr w:type="spellStart"/>
+      <w:r>
+        <w:t>inline</w:t>
+      </w:r>
+      <w:proofErr w:type="spellEnd"/>
+      <w:r>
+        <w:t xml:space="preserve"> with widget code, but in a </w:t>
       </w:r>
       <w:r>
         <w:t xml:space="preserve">larger-scale app it should be separated for maintainability and security. </w:t>

</xml_diff>